<commit_message>
Initial commit: Complete Student Management System with Admin, Lecturer features
</commit_message>
<xml_diff>
--- a/Chi tiết đề tài.docx
+++ b/Chi tiết đề tài.docx
@@ -12,16 +12,16 @@
         <w:rPr>
           <w:rFonts w:hint="default" w:ascii="Times New Roman" w:hAnsi="Times New Roman" w:cs="Times New Roman"/>
           <w:color w:val="auto"/>
-          <w:sz w:val="32"/>
-          <w:szCs w:val="32"/>
+          <w:sz w:val="26"/>
+          <w:szCs w:val="26"/>
         </w:rPr>
       </w:pPr>
       <w:r>
         <w:rPr>
           <w:rFonts w:hint="default" w:ascii="Times New Roman" w:hAnsi="Times New Roman" w:cs="Times New Roman"/>
           <w:color w:val="auto"/>
-          <w:sz w:val="32"/>
-          <w:szCs w:val="32"/>
+          <w:sz w:val="26"/>
+          <w:szCs w:val="26"/>
         </w:rPr>
         <w:t>1. Tổng quan Dự án</w:t>
       </w:r>
@@ -124,7 +124,7 @@
         <w:keepLines w:val="0"/>
         <w:widowControl/>
         <w:suppressLineNumbers w:val="0"/>
-        <w:ind w:left="1440"/>
+        <w:ind w:firstLine="720" w:firstLineChars="0"/>
         <w:rPr>
           <w:rFonts w:hint="default" w:ascii="Times New Roman" w:hAnsi="Times New Roman" w:cs="Times New Roman"/>
           <w:sz w:val="26"/>
@@ -133,13 +133,29 @@
       </w:pPr>
       <w:r>
         <w:rPr>
+          <w:rFonts w:hint="default" w:ascii="Times New Roman" w:hAnsi="Times New Roman" w:eastAsia="Symbol" w:cs="Times New Roman"/>
+          <w:sz w:val="26"/>
+          <w:szCs w:val="26"/>
+        </w:rPr>
+        <w:t>·</w:t>
+      </w:r>
+      <w:r>
+        <w:rPr>
+          <w:rFonts w:hint="default" w:ascii="Times New Roman" w:hAnsi="Times New Roman" w:eastAsia="SimSun" w:cs="Times New Roman"/>
+          <w:sz w:val="26"/>
+          <w:szCs w:val="26"/>
+        </w:rPr>
+        <w:t xml:space="preserve">  </w:t>
+      </w:r>
+      <w:r>
+        <w:rPr>
           <w:rFonts w:hint="default" w:ascii="Times New Roman" w:hAnsi="Times New Roman" w:cs="Times New Roman"/>
           <w:b/>
           <w:bCs/>
           <w:sz w:val="26"/>
           <w:szCs w:val="26"/>
         </w:rPr>
-        <w:t>Web App:</w:t>
+        <w:t>Đa nền tảng (Web App &amp; Mobile App):</w:t>
       </w:r>
       <w:r>
         <w:rPr>
@@ -147,7 +163,7 @@
           <w:sz w:val="26"/>
           <w:szCs w:val="26"/>
         </w:rPr>
-        <w:t xml:space="preserve"> Dành cho Quản trị viên (Giáo vụ), Giảng viên và Sinh viên (để xử lý tác vụ phức tạp).</w:t>
+        <w:t xml:space="preserve"> Hệ thống được xây dựng đồng bộ trên cả hai nền tảng Website và Ứng dụng di động.</w:t>
       </w:r>
     </w:p>
     <w:p>
@@ -157,7 +173,7 @@
         <w:keepLines w:val="0"/>
         <w:widowControl/>
         <w:suppressLineNumbers w:val="0"/>
-        <w:ind w:left="1440"/>
+        <w:ind w:firstLine="720" w:firstLineChars="0"/>
         <w:rPr>
           <w:rFonts w:hint="default" w:ascii="Times New Roman" w:hAnsi="Times New Roman" w:cs="Times New Roman"/>
           <w:sz w:val="26"/>
@@ -166,13 +182,29 @@
       </w:pPr>
       <w:r>
         <w:rPr>
+          <w:rFonts w:hint="default" w:ascii="Times New Roman" w:hAnsi="Times New Roman" w:eastAsia="Symbol" w:cs="Times New Roman"/>
+          <w:sz w:val="26"/>
+          <w:szCs w:val="26"/>
+        </w:rPr>
+        <w:t>·</w:t>
+      </w:r>
+      <w:r>
+        <w:rPr>
+          <w:rFonts w:hint="default" w:ascii="Times New Roman" w:hAnsi="Times New Roman" w:eastAsia="SimSun" w:cs="Times New Roman"/>
+          <w:sz w:val="26"/>
+          <w:szCs w:val="26"/>
+        </w:rPr>
+        <w:t xml:space="preserve">  </w:t>
+      </w:r>
+      <w:r>
+        <w:rPr>
           <w:rFonts w:hint="default" w:ascii="Times New Roman" w:hAnsi="Times New Roman" w:cs="Times New Roman"/>
           <w:b/>
           <w:bCs/>
           <w:sz w:val="26"/>
           <w:szCs w:val="26"/>
         </w:rPr>
-        <w:t>Mobile App:</w:t>
+        <w:t>Đối tượng sử dụng:</w:t>
       </w:r>
       <w:r>
         <w:rPr>
@@ -180,7 +212,7 @@
           <w:sz w:val="26"/>
           <w:szCs w:val="26"/>
         </w:rPr>
-        <w:t xml:space="preserve"> Dành riêng cho Sinh viên (ưu tiên trải nghiệm xem lịch, tra cứu điểm, nhận thông báo).</w:t>
+        <w:t xml:space="preserve"> Tất cả các nhóm người dùng (Quản trị viên, Giảng viên, Sinh viên) đều có thể truy cập đầy đủ các chức năng nghiệp vụ trên cả Web và Mobile. Dữ liệu được đồng bộ hóa tức thời (Realtime) giúp trải nghiệm người dùng liền mạch giữa các thiết bị</w:t>
       </w:r>
     </w:p>
     <w:p>
@@ -193,22 +225,39 @@
         <w:rPr>
           <w:rFonts w:hint="default" w:ascii="Times New Roman" w:hAnsi="Times New Roman" w:cs="Times New Roman"/>
           <w:color w:val="auto"/>
-          <w:sz w:val="32"/>
-          <w:szCs w:val="32"/>
+          <w:sz w:val="26"/>
+          <w:szCs w:val="26"/>
         </w:rPr>
       </w:pPr>
       <w:r>
         <w:rPr>
+          <w:rFonts w:hint="default" w:ascii="Times New Roman" w:hAnsi="Times New Roman" w:eastAsia="Symbol" w:cs="Times New Roman"/>
+          <w:sz w:val="26"/>
+          <w:szCs w:val="26"/>
+        </w:rPr>
+        <w:t>·</w:t>
+      </w:r>
+      <w:r>
+        <w:rPr>
+          <w:rFonts w:hint="default" w:ascii="Times New Roman" w:hAnsi="Times New Roman" w:eastAsia="SimSun" w:cs="Times New Roman"/>
+          <w:sz w:val="26"/>
+          <w:szCs w:val="26"/>
+        </w:rPr>
+        <w:t xml:space="preserve">  </w:t>
+      </w:r>
+      <w:r>
+        <w:rPr>
           <w:rFonts w:hint="default" w:ascii="Times New Roman" w:hAnsi="Times New Roman" w:cs="Times New Roman"/>
           <w:color w:val="auto"/>
-          <w:sz w:val="32"/>
-          <w:szCs w:val="32"/>
+          <w:sz w:val="26"/>
+          <w:szCs w:val="26"/>
         </w:rPr>
         <w:t>2. Kiến trúc Công nghệ (Tech Stack)</w:t>
       </w:r>
     </w:p>
     <w:tbl>
       <w:tblPr>
+        <w:tblStyle w:val="12"/>
         <w:tblW w:w="9289" w:type="dxa"/>
         <w:tblInd w:w="93" w:type="dxa"/>
         <w:tblBorders>
@@ -219,7 +268,7 @@
           <w:insideH w:val="none" w:color="auto" w:sz="0" w:space="0"/>
           <w:insideV w:val="none" w:color="auto" w:sz="0" w:space="0"/>
         </w:tblBorders>
-        <w:shd w:val="clear"/>
+        <w:shd w:val="clear" w:color="auto" w:fill="auto"/>
         <w:tblLayout w:type="autofit"/>
         <w:tblCellMar>
           <w:top w:w="0" w:type="dxa"/>
@@ -243,7 +292,7 @@
             <w:insideH w:val="none" w:color="auto" w:sz="0" w:space="0"/>
             <w:insideV w:val="none" w:color="auto" w:sz="0" w:space="0"/>
           </w:tblBorders>
-          <w:shd w:val="clear"/>
+          <w:shd w:val="clear" w:color="auto" w:fill="auto"/>
           <w:tblCellMar>
             <w:top w:w="0" w:type="dxa"/>
             <w:left w:w="108" w:type="dxa"/>
@@ -263,7 +312,7 @@
               <w:bottom w:val="single" w:color="000000" w:sz="8" w:space="0"/>
               <w:right w:val="single" w:color="000000" w:sz="8" w:space="0"/>
             </w:tcBorders>
-            <w:shd w:val="clear"/>
+            <w:shd w:val="clear" w:color="auto" w:fill="auto"/>
             <w:vAlign w:val="center"/>
           </w:tcPr>
           <w:p>
@@ -272,8 +321,10 @@
               <w:keepLines w:val="0"/>
               <w:widowControl/>
               <w:suppressLineNumbers w:val="0"/>
+              <w:bidi w:val="0"/>
+              <w:spacing w:before="0" w:beforeAutospacing="0" w:after="0" w:afterAutospacing="0" w:line="14" w:lineRule="atLeast"/>
+              <w:ind w:left="0" w:leftChars="0" w:right="0" w:rightChars="0"/>
               <w:jc w:val="left"/>
-              <w:textAlignment w:val="center"/>
               <w:rPr>
                 <w:rFonts w:hint="default" w:ascii="Times New Roman" w:hAnsi="Times New Roman" w:cs="Times New Roman"/>
                 <w:b/>
@@ -288,17 +339,12 @@
             </w:pPr>
             <w:r>
               <w:rPr>
-                <w:rFonts w:hint="default" w:ascii="Times New Roman" w:hAnsi="Times New Roman" w:eastAsia="SimSun" w:cs="Times New Roman"/>
-                <w:b/>
-                <w:bCs/>
-                <w:i w:val="0"/>
-                <w:iCs w:val="0"/>
-                <w:color w:val="000000"/>
+                <w:rStyle w:val="35"/>
+                <w:rFonts w:hint="default" w:ascii="Times New Roman" w:hAnsi="Times New Roman" w:eastAsia="sans-serif" w:cs="Times New Roman"/>
+                <w:color w:val="1F1F1F"/>
                 <w:kern w:val="0"/>
                 <w:sz w:val="26"/>
                 <w:szCs w:val="26"/>
-                <w:u w:val="none"/>
-                <w:bdr w:val="none" w:color="auto" w:sz="0" w:space="0"/>
                 <w:lang w:val="en-US" w:eastAsia="zh-CN" w:bidi="ar"/>
               </w:rPr>
               <w:t>Thành phần</w:t>
@@ -314,7 +360,7 @@
               <w:bottom w:val="single" w:color="000000" w:sz="8" w:space="0"/>
               <w:right w:val="single" w:color="000000" w:sz="8" w:space="0"/>
             </w:tcBorders>
-            <w:shd w:val="clear"/>
+            <w:shd w:val="clear" w:color="auto" w:fill="auto"/>
             <w:vAlign w:val="center"/>
           </w:tcPr>
           <w:p>
@@ -323,8 +369,10 @@
               <w:keepLines w:val="0"/>
               <w:widowControl/>
               <w:suppressLineNumbers w:val="0"/>
+              <w:bidi w:val="0"/>
+              <w:spacing w:before="0" w:beforeAutospacing="0" w:after="0" w:afterAutospacing="0" w:line="14" w:lineRule="atLeast"/>
+              <w:ind w:left="0" w:leftChars="0" w:right="0" w:rightChars="0"/>
               <w:jc w:val="left"/>
-              <w:textAlignment w:val="center"/>
               <w:rPr>
                 <w:rFonts w:hint="default" w:ascii="Times New Roman" w:hAnsi="Times New Roman" w:cs="Times New Roman"/>
                 <w:b/>
@@ -339,17 +387,12 @@
             </w:pPr>
             <w:r>
               <w:rPr>
-                <w:rFonts w:hint="default" w:ascii="Times New Roman" w:hAnsi="Times New Roman" w:eastAsia="SimSun" w:cs="Times New Roman"/>
-                <w:b/>
-                <w:bCs/>
-                <w:i w:val="0"/>
-                <w:iCs w:val="0"/>
-                <w:color w:val="000000"/>
+                <w:rStyle w:val="35"/>
+                <w:rFonts w:hint="default" w:ascii="Times New Roman" w:hAnsi="Times New Roman" w:eastAsia="sans-serif" w:cs="Times New Roman"/>
+                <w:color w:val="1F1F1F"/>
                 <w:kern w:val="0"/>
                 <w:sz w:val="26"/>
                 <w:szCs w:val="26"/>
-                <w:u w:val="none"/>
-                <w:bdr w:val="none" w:color="auto" w:sz="0" w:space="0"/>
                 <w:lang w:val="en-US" w:eastAsia="zh-CN" w:bidi="ar"/>
               </w:rPr>
               <w:t>Công nghệ</w:t>
@@ -365,7 +408,7 @@
               <w:bottom w:val="single" w:color="000000" w:sz="8" w:space="0"/>
               <w:right w:val="single" w:color="000000" w:sz="8" w:space="0"/>
             </w:tcBorders>
-            <w:shd w:val="clear"/>
+            <w:shd w:val="clear" w:color="auto" w:fill="auto"/>
             <w:vAlign w:val="center"/>
           </w:tcPr>
           <w:p>
@@ -374,8 +417,10 @@
               <w:keepLines w:val="0"/>
               <w:widowControl/>
               <w:suppressLineNumbers w:val="0"/>
+              <w:bidi w:val="0"/>
+              <w:spacing w:before="0" w:beforeAutospacing="0" w:after="0" w:afterAutospacing="0" w:line="14" w:lineRule="atLeast"/>
+              <w:ind w:left="0" w:leftChars="0" w:right="0" w:rightChars="0"/>
               <w:jc w:val="left"/>
-              <w:textAlignment w:val="center"/>
               <w:rPr>
                 <w:rFonts w:hint="default" w:ascii="Times New Roman" w:hAnsi="Times New Roman" w:cs="Times New Roman"/>
                 <w:b/>
@@ -390,17 +435,12 @@
             </w:pPr>
             <w:r>
               <w:rPr>
-                <w:rFonts w:hint="default" w:ascii="Times New Roman" w:hAnsi="Times New Roman" w:eastAsia="SimSun" w:cs="Times New Roman"/>
-                <w:b/>
-                <w:bCs/>
-                <w:i w:val="0"/>
-                <w:iCs w:val="0"/>
-                <w:color w:val="000000"/>
+                <w:rStyle w:val="35"/>
+                <w:rFonts w:hint="default" w:ascii="Times New Roman" w:hAnsi="Times New Roman" w:eastAsia="sans-serif" w:cs="Times New Roman"/>
+                <w:color w:val="1F1F1F"/>
                 <w:kern w:val="0"/>
                 <w:sz w:val="26"/>
                 <w:szCs w:val="26"/>
-                <w:u w:val="none"/>
-                <w:bdr w:val="none" w:color="auto" w:sz="0" w:space="0"/>
                 <w:lang w:val="en-US" w:eastAsia="zh-CN" w:bidi="ar"/>
               </w:rPr>
               <w:t>Chi tiết kỹ thuật</w:t>
@@ -437,7 +477,7 @@
               <w:bottom w:val="single" w:color="000000" w:sz="8" w:space="0"/>
               <w:right w:val="single" w:color="000000" w:sz="8" w:space="0"/>
             </w:tcBorders>
-            <w:shd w:val="clear"/>
+            <w:shd w:val="clear" w:color="auto" w:fill="auto"/>
             <w:vAlign w:val="center"/>
           </w:tcPr>
           <w:p>
@@ -446,8 +486,10 @@
               <w:keepLines w:val="0"/>
               <w:widowControl/>
               <w:suppressLineNumbers w:val="0"/>
+              <w:bidi w:val="0"/>
+              <w:spacing w:before="0" w:beforeAutospacing="0" w:after="0" w:afterAutospacing="0" w:line="14" w:lineRule="atLeast"/>
+              <w:ind w:left="0" w:leftChars="0" w:right="0" w:rightChars="0"/>
               <w:jc w:val="left"/>
-              <w:textAlignment w:val="center"/>
               <w:rPr>
                 <w:rFonts w:hint="default" w:ascii="Times New Roman" w:hAnsi="Times New Roman" w:cs="Times New Roman"/>
                 <w:b/>
@@ -462,17 +504,13 @@
             </w:pPr>
             <w:r>
               <w:rPr>
-                <w:rFonts w:hint="default" w:ascii="Times New Roman" w:hAnsi="Times New Roman" w:eastAsia="SimSun" w:cs="Times New Roman"/>
+                <w:rFonts w:hint="default" w:ascii="Times New Roman" w:hAnsi="Times New Roman" w:eastAsia="sans-serif" w:cs="Times New Roman"/>
                 <w:b/>
                 <w:bCs/>
-                <w:i w:val="0"/>
-                <w:iCs w:val="0"/>
-                <w:color w:val="000000"/>
+                <w:color w:val="1F1F1F"/>
                 <w:kern w:val="0"/>
                 <w:sz w:val="26"/>
                 <w:szCs w:val="26"/>
-                <w:u w:val="none"/>
-                <w:bdr w:val="none" w:color="auto" w:sz="0" w:space="0"/>
                 <w:lang w:val="en-US" w:eastAsia="zh-CN" w:bidi="ar"/>
               </w:rPr>
               <w:t>Frontend (Web)</w:t>
@@ -488,7 +526,7 @@
               <w:bottom w:val="single" w:color="000000" w:sz="8" w:space="0"/>
               <w:right w:val="single" w:color="000000" w:sz="8" w:space="0"/>
             </w:tcBorders>
-            <w:shd w:val="clear"/>
+            <w:shd w:val="clear" w:color="auto" w:fill="auto"/>
             <w:vAlign w:val="center"/>
           </w:tcPr>
           <w:p>
@@ -497,8 +535,10 @@
               <w:keepLines w:val="0"/>
               <w:widowControl/>
               <w:suppressLineNumbers w:val="0"/>
+              <w:bidi w:val="0"/>
+              <w:spacing w:before="0" w:beforeAutospacing="0" w:after="0" w:afterAutospacing="0" w:line="14" w:lineRule="atLeast"/>
+              <w:ind w:left="0" w:leftChars="0" w:right="0" w:rightChars="0"/>
               <w:jc w:val="left"/>
-              <w:textAlignment w:val="center"/>
               <w:rPr>
                 <w:rFonts w:hint="default" w:ascii="Times New Roman" w:hAnsi="Times New Roman" w:cs="Times New Roman"/>
                 <w:b/>
@@ -513,17 +553,11 @@
             </w:pPr>
             <w:r>
               <w:rPr>
-                <w:rFonts w:hint="default" w:ascii="Times New Roman" w:hAnsi="Times New Roman" w:eastAsia="SimSun" w:cs="Times New Roman"/>
-                <w:b/>
-                <w:bCs/>
-                <w:i w:val="0"/>
-                <w:iCs w:val="0"/>
-                <w:color w:val="000000"/>
+                <w:rFonts w:hint="default" w:ascii="Times New Roman" w:hAnsi="Times New Roman" w:eastAsia="sans-serif" w:cs="Times New Roman"/>
+                <w:color w:val="1F1F1F"/>
                 <w:kern w:val="0"/>
                 <w:sz w:val="26"/>
                 <w:szCs w:val="26"/>
-                <w:u w:val="none"/>
-                <w:bdr w:val="none" w:color="auto" w:sz="0" w:space="0"/>
                 <w:lang w:val="en-US" w:eastAsia="zh-CN" w:bidi="ar"/>
               </w:rPr>
               <w:t>ReactJS</w:t>
@@ -539,7 +573,7 @@
               <w:bottom w:val="single" w:color="000000" w:sz="8" w:space="0"/>
               <w:right w:val="single" w:color="000000" w:sz="8" w:space="0"/>
             </w:tcBorders>
-            <w:shd w:val="clear"/>
+            <w:shd w:val="clear" w:color="auto" w:fill="auto"/>
             <w:vAlign w:val="center"/>
           </w:tcPr>
           <w:p>
@@ -548,8 +582,10 @@
               <w:keepLines w:val="0"/>
               <w:widowControl/>
               <w:suppressLineNumbers w:val="0"/>
+              <w:bidi w:val="0"/>
+              <w:spacing w:before="0" w:beforeAutospacing="0" w:after="0" w:afterAutospacing="0" w:line="14" w:lineRule="atLeast"/>
+              <w:ind w:left="0" w:leftChars="0" w:right="0" w:rightChars="0"/>
               <w:jc w:val="left"/>
-              <w:textAlignment w:val="center"/>
               <w:rPr>
                 <w:rFonts w:hint="default" w:ascii="Times New Roman" w:hAnsi="Times New Roman" w:cs="Times New Roman"/>
                 <w:i w:val="0"/>
@@ -562,18 +598,14 @@
             </w:pPr>
             <w:r>
               <w:rPr>
-                <w:rFonts w:hint="default" w:ascii="Times New Roman" w:hAnsi="Times New Roman" w:eastAsia="SimSun" w:cs="Times New Roman"/>
-                <w:i w:val="0"/>
-                <w:iCs w:val="0"/>
-                <w:color w:val="000000"/>
+                <w:rFonts w:hint="default" w:ascii="Times New Roman" w:hAnsi="Times New Roman" w:eastAsia="sans-serif" w:cs="Times New Roman"/>
+                <w:color w:val="1F1F1F"/>
                 <w:kern w:val="0"/>
                 <w:sz w:val="26"/>
                 <w:szCs w:val="26"/>
-                <w:u w:val="none"/>
-                <w:bdr w:val="none" w:color="auto" w:sz="0" w:space="0"/>
                 <w:lang w:val="en-US" w:eastAsia="zh-CN" w:bidi="ar"/>
               </w:rPr>
-              <w:t>Xử lý các bảng biểu phức tạp (nhập điểm, xếp lịch).</w:t>
+              <w:t>Giao diện quản lý tương thích mọi kích thước màn hình (Responsive), xử lý các bảng biểu phức tạp.</w:t>
             </w:r>
           </w:p>
         </w:tc>
@@ -607,7 +639,7 @@
               <w:bottom w:val="single" w:color="000000" w:sz="8" w:space="0"/>
               <w:right w:val="single" w:color="000000" w:sz="8" w:space="0"/>
             </w:tcBorders>
-            <w:shd w:val="clear"/>
+            <w:shd w:val="clear" w:color="auto" w:fill="auto"/>
             <w:vAlign w:val="center"/>
           </w:tcPr>
           <w:p>
@@ -616,8 +648,10 @@
               <w:keepLines w:val="0"/>
               <w:widowControl/>
               <w:suppressLineNumbers w:val="0"/>
+              <w:bidi w:val="0"/>
+              <w:spacing w:before="0" w:beforeAutospacing="0" w:after="0" w:afterAutospacing="0" w:line="14" w:lineRule="atLeast"/>
+              <w:ind w:left="0" w:leftChars="0" w:right="0" w:rightChars="0"/>
               <w:jc w:val="left"/>
-              <w:textAlignment w:val="center"/>
               <w:rPr>
                 <w:rFonts w:hint="default" w:ascii="Times New Roman" w:hAnsi="Times New Roman" w:cs="Times New Roman"/>
                 <w:b/>
@@ -632,17 +666,13 @@
             </w:pPr>
             <w:r>
               <w:rPr>
-                <w:rFonts w:hint="default" w:ascii="Times New Roman" w:hAnsi="Times New Roman" w:eastAsia="SimSun" w:cs="Times New Roman"/>
+                <w:rFonts w:hint="default" w:ascii="Times New Roman" w:hAnsi="Times New Roman" w:eastAsia="sans-serif" w:cs="Times New Roman"/>
                 <w:b/>
                 <w:bCs/>
-                <w:i w:val="0"/>
-                <w:iCs w:val="0"/>
-                <w:color w:val="000000"/>
+                <w:color w:val="1F1F1F"/>
                 <w:kern w:val="0"/>
                 <w:sz w:val="26"/>
                 <w:szCs w:val="26"/>
-                <w:u w:val="none"/>
-                <w:bdr w:val="none" w:color="auto" w:sz="0" w:space="0"/>
                 <w:lang w:val="en-US" w:eastAsia="zh-CN" w:bidi="ar"/>
               </w:rPr>
               <w:t>Frontend (Mobile)</w:t>
@@ -658,7 +688,7 @@
               <w:bottom w:val="single" w:color="000000" w:sz="8" w:space="0"/>
               <w:right w:val="single" w:color="000000" w:sz="8" w:space="0"/>
             </w:tcBorders>
-            <w:shd w:val="clear"/>
+            <w:shd w:val="clear" w:color="auto" w:fill="auto"/>
             <w:vAlign w:val="center"/>
           </w:tcPr>
           <w:p>
@@ -667,8 +697,10 @@
               <w:keepLines w:val="0"/>
               <w:widowControl/>
               <w:suppressLineNumbers w:val="0"/>
+              <w:bidi w:val="0"/>
+              <w:spacing w:before="0" w:beforeAutospacing="0" w:after="0" w:afterAutospacing="0" w:line="14" w:lineRule="atLeast"/>
+              <w:ind w:left="0" w:leftChars="0" w:right="0" w:rightChars="0"/>
               <w:jc w:val="left"/>
-              <w:textAlignment w:val="center"/>
               <w:rPr>
                 <w:rFonts w:hint="default" w:ascii="Times New Roman" w:hAnsi="Times New Roman" w:cs="Times New Roman"/>
                 <w:b/>
@@ -683,17 +715,11 @@
             </w:pPr>
             <w:r>
               <w:rPr>
-                <w:rFonts w:hint="default" w:ascii="Times New Roman" w:hAnsi="Times New Roman" w:eastAsia="SimSun" w:cs="Times New Roman"/>
-                <w:b/>
-                <w:bCs/>
-                <w:i w:val="0"/>
-                <w:iCs w:val="0"/>
-                <w:color w:val="000000"/>
+                <w:rFonts w:hint="default" w:ascii="Times New Roman" w:hAnsi="Times New Roman" w:eastAsia="sans-serif" w:cs="Times New Roman"/>
+                <w:color w:val="1F1F1F"/>
                 <w:kern w:val="0"/>
                 <w:sz w:val="26"/>
                 <w:szCs w:val="26"/>
-                <w:u w:val="none"/>
-                <w:bdr w:val="none" w:color="auto" w:sz="0" w:space="0"/>
                 <w:lang w:val="en-US" w:eastAsia="zh-CN" w:bidi="ar"/>
               </w:rPr>
               <w:t>Flutter</w:t>
@@ -709,7 +735,7 @@
               <w:bottom w:val="single" w:color="000000" w:sz="8" w:space="0"/>
               <w:right w:val="single" w:color="000000" w:sz="8" w:space="0"/>
             </w:tcBorders>
-            <w:shd w:val="clear"/>
+            <w:shd w:val="clear" w:color="auto" w:fill="auto"/>
             <w:vAlign w:val="center"/>
           </w:tcPr>
           <w:p>
@@ -718,8 +744,10 @@
               <w:keepLines w:val="0"/>
               <w:widowControl/>
               <w:suppressLineNumbers w:val="0"/>
+              <w:bidi w:val="0"/>
+              <w:spacing w:before="0" w:beforeAutospacing="0" w:after="0" w:afterAutospacing="0" w:line="14" w:lineRule="atLeast"/>
+              <w:ind w:left="0" w:leftChars="0" w:right="0" w:rightChars="0"/>
               <w:jc w:val="left"/>
-              <w:textAlignment w:val="center"/>
               <w:rPr>
                 <w:rFonts w:hint="default" w:ascii="Times New Roman" w:hAnsi="Times New Roman" w:cs="Times New Roman"/>
                 <w:i w:val="0"/>
@@ -732,18 +760,14 @@
             </w:pPr>
             <w:r>
               <w:rPr>
-                <w:rFonts w:hint="default" w:ascii="Times New Roman" w:hAnsi="Times New Roman" w:eastAsia="SimSun" w:cs="Times New Roman"/>
-                <w:i w:val="0"/>
-                <w:iCs w:val="0"/>
-                <w:color w:val="000000"/>
+                <w:rFonts w:hint="default" w:ascii="Times New Roman" w:hAnsi="Times New Roman" w:eastAsia="sans-serif" w:cs="Times New Roman"/>
+                <w:color w:val="1F1F1F"/>
                 <w:kern w:val="0"/>
                 <w:sz w:val="26"/>
                 <w:szCs w:val="26"/>
-                <w:u w:val="none"/>
-                <w:bdr w:val="none" w:color="auto" w:sz="0" w:space="0"/>
                 <w:lang w:val="en-US" w:eastAsia="zh-CN" w:bidi="ar"/>
               </w:rPr>
-              <w:t>Đa nền tảng (iOS/Android), trải nghiệm mượt mà cho sinh viên.</w:t>
+              <w:t>Ứng dụng đa nền tảng (iOS/Android), giao diện đồng bộ với Web, trải nghiệm mượt mà.</w:t>
             </w:r>
           </w:p>
         </w:tc>
@@ -758,7 +782,6 @@
             <w:insideH w:val="none" w:color="auto" w:sz="0" w:space="0"/>
             <w:insideV w:val="none" w:color="auto" w:sz="0" w:space="0"/>
           </w:tblBorders>
-          <w:shd w:val="clear"/>
           <w:tblCellMar>
             <w:top w:w="0" w:type="dxa"/>
             <w:left w:w="108" w:type="dxa"/>
@@ -778,7 +801,7 @@
               <w:bottom w:val="single" w:color="000000" w:sz="8" w:space="0"/>
               <w:right w:val="single" w:color="000000" w:sz="8" w:space="0"/>
             </w:tcBorders>
-            <w:shd w:val="clear"/>
+            <w:shd w:val="clear" w:color="auto" w:fill="auto"/>
             <w:vAlign w:val="center"/>
           </w:tcPr>
           <w:p>
@@ -787,8 +810,10 @@
               <w:keepLines w:val="0"/>
               <w:widowControl/>
               <w:suppressLineNumbers w:val="0"/>
+              <w:bidi w:val="0"/>
+              <w:spacing w:before="0" w:beforeAutospacing="0" w:after="0" w:afterAutospacing="0" w:line="14" w:lineRule="atLeast"/>
+              <w:ind w:left="0" w:leftChars="0" w:right="0" w:rightChars="0"/>
               <w:jc w:val="left"/>
-              <w:textAlignment w:val="center"/>
               <w:rPr>
                 <w:rFonts w:hint="default" w:ascii="Times New Roman" w:hAnsi="Times New Roman" w:cs="Times New Roman"/>
                 <w:b/>
@@ -803,17 +828,13 @@
             </w:pPr>
             <w:r>
               <w:rPr>
-                <w:rFonts w:hint="default" w:ascii="Times New Roman" w:hAnsi="Times New Roman" w:eastAsia="SimSun" w:cs="Times New Roman"/>
+                <w:rFonts w:hint="default" w:ascii="Times New Roman" w:hAnsi="Times New Roman" w:eastAsia="sans-serif" w:cs="Times New Roman"/>
                 <w:b/>
                 <w:bCs/>
-                <w:i w:val="0"/>
-                <w:iCs w:val="0"/>
-                <w:color w:val="000000"/>
+                <w:color w:val="1F1F1F"/>
                 <w:kern w:val="0"/>
                 <w:sz w:val="26"/>
                 <w:szCs w:val="26"/>
-                <w:u w:val="none"/>
-                <w:bdr w:val="none" w:color="auto" w:sz="0" w:space="0"/>
                 <w:lang w:val="en-US" w:eastAsia="zh-CN" w:bidi="ar"/>
               </w:rPr>
               <w:t>Backend</w:t>
@@ -829,7 +850,7 @@
               <w:bottom w:val="single" w:color="000000" w:sz="8" w:space="0"/>
               <w:right w:val="single" w:color="000000" w:sz="8" w:space="0"/>
             </w:tcBorders>
-            <w:shd w:val="clear"/>
+            <w:shd w:val="clear" w:color="auto" w:fill="auto"/>
             <w:vAlign w:val="center"/>
           </w:tcPr>
           <w:p>
@@ -838,8 +859,10 @@
               <w:keepLines w:val="0"/>
               <w:widowControl/>
               <w:suppressLineNumbers w:val="0"/>
+              <w:bidi w:val="0"/>
+              <w:spacing w:before="0" w:beforeAutospacing="0" w:after="0" w:afterAutospacing="0" w:line="14" w:lineRule="atLeast"/>
+              <w:ind w:left="0" w:leftChars="0" w:right="0" w:rightChars="0"/>
               <w:jc w:val="left"/>
-              <w:textAlignment w:val="center"/>
               <w:rPr>
                 <w:rFonts w:hint="default" w:ascii="Times New Roman" w:hAnsi="Times New Roman" w:cs="Times New Roman"/>
                 <w:b/>
@@ -850,24 +873,19 @@
                 <w:sz w:val="26"/>
                 <w:szCs w:val="26"/>
                 <w:u w:val="none"/>
+                <w:lang w:val="en-US"/>
               </w:rPr>
             </w:pPr>
             <w:r>
               <w:rPr>
-                <w:rFonts w:hint="default" w:ascii="Times New Roman" w:hAnsi="Times New Roman" w:eastAsia="SimSun" w:cs="Times New Roman"/>
-                <w:b/>
-                <w:bCs/>
-                <w:i w:val="0"/>
-                <w:iCs w:val="0"/>
-                <w:color w:val="000000"/>
+                <w:rFonts w:hint="default" w:ascii="Times New Roman" w:hAnsi="Times New Roman" w:eastAsia="sans-serif" w:cs="Times New Roman"/>
+                <w:color w:val="1F1F1F"/>
                 <w:kern w:val="0"/>
                 <w:sz w:val="26"/>
                 <w:szCs w:val="26"/>
-                <w:u w:val="none"/>
-                <w:bdr w:val="none" w:color="auto" w:sz="0" w:space="0"/>
                 <w:lang w:val="en-US" w:eastAsia="zh-CN" w:bidi="ar"/>
               </w:rPr>
-              <w:t>Node.js</w:t>
+              <w:t>Node.js (hoặc Supabase Edge Functions)</w:t>
             </w:r>
           </w:p>
         </w:tc>
@@ -880,7 +898,7 @@
               <w:bottom w:val="single" w:color="000000" w:sz="8" w:space="0"/>
               <w:right w:val="single" w:color="000000" w:sz="8" w:space="0"/>
             </w:tcBorders>
-            <w:shd w:val="clear"/>
+            <w:shd w:val="clear" w:color="auto" w:fill="auto"/>
             <w:vAlign w:val="center"/>
           </w:tcPr>
           <w:p>
@@ -889,8 +907,10 @@
               <w:keepLines w:val="0"/>
               <w:widowControl/>
               <w:suppressLineNumbers w:val="0"/>
+              <w:bidi w:val="0"/>
+              <w:spacing w:before="0" w:beforeAutospacing="0" w:after="0" w:afterAutospacing="0" w:line="14" w:lineRule="atLeast"/>
+              <w:ind w:left="0" w:leftChars="0" w:right="0" w:rightChars="0"/>
               <w:jc w:val="left"/>
-              <w:textAlignment w:val="center"/>
               <w:rPr>
                 <w:rFonts w:hint="default" w:ascii="Times New Roman" w:hAnsi="Times New Roman" w:cs="Times New Roman"/>
                 <w:i w:val="0"/>
@@ -903,18 +923,14 @@
             </w:pPr>
             <w:r>
               <w:rPr>
-                <w:rFonts w:hint="default" w:ascii="Times New Roman" w:hAnsi="Times New Roman" w:eastAsia="SimSun" w:cs="Times New Roman"/>
-                <w:i w:val="0"/>
-                <w:iCs w:val="0"/>
-                <w:color w:val="000000"/>
+                <w:rFonts w:hint="default" w:ascii="Times New Roman" w:hAnsi="Times New Roman" w:eastAsia="sans-serif" w:cs="Times New Roman"/>
+                <w:color w:val="1F1F1F"/>
                 <w:kern w:val="0"/>
                 <w:sz w:val="26"/>
                 <w:szCs w:val="26"/>
-                <w:u w:val="none"/>
-                <w:bdr w:val="none" w:color="auto" w:sz="0" w:space="0"/>
                 <w:lang w:val="en-US" w:eastAsia="zh-CN" w:bidi="ar"/>
               </w:rPr>
-              <w:t>Xử lý logic nghiệp vụ và API.</w:t>
+              <w:t>Xử lý logic nghiệp vụ phức tạp và API trung gian (nếu cần).</w:t>
             </w:r>
           </w:p>
         </w:tc>
@@ -948,7 +964,7 @@
               <w:bottom w:val="single" w:color="000000" w:sz="8" w:space="0"/>
               <w:right w:val="single" w:color="000000" w:sz="8" w:space="0"/>
             </w:tcBorders>
-            <w:shd w:val="clear"/>
+            <w:shd w:val="clear" w:color="auto" w:fill="auto"/>
             <w:vAlign w:val="center"/>
           </w:tcPr>
           <w:p>
@@ -957,8 +973,10 @@
               <w:keepLines w:val="0"/>
               <w:widowControl/>
               <w:suppressLineNumbers w:val="0"/>
+              <w:bidi w:val="0"/>
+              <w:spacing w:before="0" w:beforeAutospacing="0" w:after="0" w:afterAutospacing="0" w:line="14" w:lineRule="atLeast"/>
+              <w:ind w:left="0" w:leftChars="0" w:right="0" w:rightChars="0"/>
               <w:jc w:val="left"/>
-              <w:textAlignment w:val="center"/>
               <w:rPr>
                 <w:rFonts w:hint="default" w:ascii="Times New Roman" w:hAnsi="Times New Roman" w:cs="Times New Roman"/>
                 <w:b/>
@@ -973,20 +991,16 @@
             </w:pPr>
             <w:r>
               <w:rPr>
-                <w:rFonts w:hint="default" w:ascii="Times New Roman" w:hAnsi="Times New Roman" w:eastAsia="SimSun" w:cs="Times New Roman"/>
+                <w:rFonts w:hint="default" w:ascii="Times New Roman" w:hAnsi="Times New Roman" w:eastAsia="sans-serif" w:cs="Times New Roman"/>
                 <w:b/>
                 <w:bCs/>
-                <w:i w:val="0"/>
-                <w:iCs w:val="0"/>
-                <w:color w:val="000000"/>
+                <w:color w:val="1F1F1F"/>
                 <w:kern w:val="0"/>
                 <w:sz w:val="26"/>
                 <w:szCs w:val="26"/>
-                <w:u w:val="none"/>
-                <w:bdr w:val="none" w:color="auto" w:sz="0" w:space="0"/>
                 <w:lang w:val="en-US" w:eastAsia="zh-CN" w:bidi="ar"/>
               </w:rPr>
-              <w:t>Database</w:t>
+              <w:t>Database &amp; Auth</w:t>
             </w:r>
           </w:p>
         </w:tc>
@@ -999,7 +1013,7 @@
               <w:bottom w:val="single" w:color="000000" w:sz="8" w:space="0"/>
               <w:right w:val="single" w:color="000000" w:sz="8" w:space="0"/>
             </w:tcBorders>
-            <w:shd w:val="clear"/>
+            <w:shd w:val="clear" w:color="auto" w:fill="auto"/>
             <w:vAlign w:val="center"/>
           </w:tcPr>
           <w:p>
@@ -1008,8 +1022,10 @@
               <w:keepLines w:val="0"/>
               <w:widowControl/>
               <w:suppressLineNumbers w:val="0"/>
+              <w:bidi w:val="0"/>
+              <w:spacing w:before="0" w:beforeAutospacing="0" w:after="0" w:afterAutospacing="0" w:line="14" w:lineRule="atLeast"/>
+              <w:ind w:left="0" w:leftChars="0" w:right="0" w:rightChars="0"/>
               <w:jc w:val="left"/>
-              <w:textAlignment w:val="center"/>
               <w:rPr>
                 <w:rFonts w:hint="default" w:ascii="Times New Roman" w:hAnsi="Times New Roman" w:cs="Times New Roman"/>
                 <w:b/>
@@ -1024,20 +1040,16 @@
             </w:pPr>
             <w:r>
               <w:rPr>
-                <w:rFonts w:hint="default" w:ascii="Times New Roman" w:hAnsi="Times New Roman" w:eastAsia="SimSun" w:cs="Times New Roman"/>
+                <w:rFonts w:hint="default" w:ascii="Times New Roman" w:hAnsi="Times New Roman" w:eastAsia="sans-serif" w:cs="Times New Roman"/>
                 <w:b/>
                 <w:bCs/>
-                <w:i w:val="0"/>
-                <w:iCs w:val="0"/>
-                <w:color w:val="000000"/>
+                <w:color w:val="1F1F1F"/>
                 <w:kern w:val="0"/>
                 <w:sz w:val="26"/>
                 <w:szCs w:val="26"/>
-                <w:u w:val="none"/>
-                <w:bdr w:val="none" w:color="auto" w:sz="0" w:space="0"/>
                 <w:lang w:val="en-US" w:eastAsia="zh-CN" w:bidi="ar"/>
               </w:rPr>
-              <w:t>PostgreSQL</w:t>
+              <w:t>Supabase</w:t>
             </w:r>
           </w:p>
         </w:tc>
@@ -1050,9 +1062,133 @@
               <w:bottom w:val="single" w:color="000000" w:sz="8" w:space="0"/>
               <w:right w:val="single" w:color="000000" w:sz="8" w:space="0"/>
             </w:tcBorders>
-            <w:shd w:val="clear"/>
+            <w:shd w:val="clear" w:color="auto" w:fill="auto"/>
             <w:vAlign w:val="center"/>
           </w:tcPr>
+          <w:p>
+            <w:pPr>
+              <w:pStyle w:val="34"/>
+              <w:keepNext w:val="0"/>
+              <w:keepLines w:val="0"/>
+              <w:widowControl/>
+              <w:suppressLineNumbers w:val="0"/>
+              <w:pBdr>
+                <w:top w:val="none" w:color="1F1F1F" w:sz="0" w:space="0"/>
+                <w:left w:val="none" w:color="1F1F1F" w:sz="0" w:space="0"/>
+                <w:bottom w:val="none" w:color="1F1F1F" w:sz="0" w:space="0"/>
+                <w:right w:val="none" w:color="1F1F1F" w:sz="0" w:space="0"/>
+              </w:pBdr>
+              <w:bidi w:val="0"/>
+              <w:spacing w:before="0" w:beforeAutospacing="0" w:after="0" w:afterAutospacing="0" w:line="14" w:lineRule="atLeast"/>
+              <w:ind w:left="0" w:right="0"/>
+              <w:rPr>
+                <w:rFonts w:hint="default" w:ascii="Times New Roman" w:hAnsi="Times New Roman" w:eastAsia="sans-serif" w:cs="Times New Roman"/>
+                <w:color w:val="1F1F1F"/>
+                <w:sz w:val="26"/>
+                <w:szCs w:val="26"/>
+              </w:rPr>
+            </w:pPr>
+            <w:r>
+              <w:rPr>
+                <w:rFonts w:hint="default" w:ascii="Times New Roman" w:hAnsi="Times New Roman" w:eastAsia="sans-serif" w:cs="Times New Roman"/>
+                <w:color w:val="1F1F1F"/>
+                <w:sz w:val="26"/>
+                <w:szCs w:val="26"/>
+              </w:rPr>
+              <w:t xml:space="preserve">- </w:t>
+            </w:r>
+            <w:r>
+              <w:rPr>
+                <w:rFonts w:hint="default" w:ascii="Times New Roman" w:hAnsi="Times New Roman" w:eastAsia="sans-serif" w:cs="Times New Roman"/>
+                <w:b/>
+                <w:bCs/>
+                <w:color w:val="1F1F1F"/>
+                <w:sz w:val="26"/>
+                <w:szCs w:val="26"/>
+              </w:rPr>
+              <w:t>Database:</w:t>
+            </w:r>
+            <w:r>
+              <w:rPr>
+                <w:rFonts w:hint="default" w:ascii="Times New Roman" w:hAnsi="Times New Roman" w:eastAsia="sans-serif" w:cs="Times New Roman"/>
+                <w:color w:val="1F1F1F"/>
+                <w:sz w:val="26"/>
+                <w:szCs w:val="26"/>
+              </w:rPr>
+              <w:t xml:space="preserve"> PostgreSQL trên nền tảng Cloud, hỗ trợ Realtime.</w:t>
+            </w:r>
+          </w:p>
+          <w:p>
+            <w:pPr>
+              <w:keepNext w:val="0"/>
+              <w:keepLines w:val="0"/>
+              <w:widowControl/>
+              <w:suppressLineNumbers w:val="0"/>
+              <w:bidi w:val="0"/>
+              <w:spacing w:before="0" w:beforeAutospacing="0" w:after="0" w:afterAutospacing="0" w:line="14" w:lineRule="atLeast"/>
+              <w:ind w:left="0" w:right="0"/>
+              <w:jc w:val="left"/>
+              <w:rPr>
+                <w:rFonts w:hint="default" w:ascii="Times New Roman" w:hAnsi="Times New Roman" w:eastAsia="sans-serif" w:cs="Times New Roman"/>
+                <w:color w:val="1F1F1F"/>
+                <w:sz w:val="26"/>
+                <w:szCs w:val="26"/>
+              </w:rPr>
+            </w:pPr>
+          </w:p>
+          <w:p>
+            <w:pPr>
+              <w:pStyle w:val="34"/>
+              <w:keepNext w:val="0"/>
+              <w:keepLines w:val="0"/>
+              <w:widowControl/>
+              <w:suppressLineNumbers w:val="0"/>
+              <w:pBdr>
+                <w:top w:val="none" w:color="1F1F1F" w:sz="0" w:space="0"/>
+                <w:left w:val="none" w:color="1F1F1F" w:sz="0" w:space="0"/>
+                <w:bottom w:val="none" w:color="1F1F1F" w:sz="0" w:space="0"/>
+                <w:right w:val="none" w:color="1F1F1F" w:sz="0" w:space="0"/>
+              </w:pBdr>
+              <w:bidi w:val="0"/>
+              <w:spacing w:before="0" w:beforeAutospacing="0" w:after="0" w:afterAutospacing="0" w:line="14" w:lineRule="atLeast"/>
+              <w:ind w:left="0" w:right="0"/>
+              <w:rPr>
+                <w:rFonts w:hint="default" w:ascii="Times New Roman" w:hAnsi="Times New Roman" w:eastAsia="sans-serif" w:cs="Times New Roman"/>
+                <w:color w:val="1F1F1F"/>
+                <w:sz w:val="26"/>
+                <w:szCs w:val="26"/>
+              </w:rPr>
+            </w:pPr>
+            <w:r>
+              <w:rPr>
+                <w:rFonts w:hint="default" w:ascii="Times New Roman" w:hAnsi="Times New Roman" w:eastAsia="sans-serif" w:cs="Times New Roman"/>
+                <w:color w:val="1F1F1F"/>
+                <w:sz w:val="26"/>
+                <w:szCs w:val="26"/>
+              </w:rPr>
+              <w:t xml:space="preserve">- </w:t>
+            </w:r>
+            <w:r>
+              <w:rPr>
+                <w:rFonts w:hint="default" w:ascii="Times New Roman" w:hAnsi="Times New Roman" w:eastAsia="sans-serif" w:cs="Times New Roman"/>
+                <w:b/>
+                <w:bCs/>
+                <w:color w:val="1F1F1F"/>
+                <w:sz w:val="26"/>
+                <w:szCs w:val="26"/>
+              </w:rPr>
+              <w:t>Authentication:</w:t>
+            </w:r>
+            <w:r>
+              <w:rPr>
+                <w:rFonts w:hint="default" w:ascii="Times New Roman" w:hAnsi="Times New Roman" w:eastAsia="sans-serif" w:cs="Times New Roman"/>
+                <w:color w:val="1F1F1F"/>
+                <w:sz w:val="26"/>
+                <w:szCs w:val="26"/>
+              </w:rPr>
+              <w:t xml:space="preserve"> Quản lý đăng nhập, xác thực người dùng (Email/Google) và phân quyền (RLS).</w:t>
+            </w:r>
+          </w:p>
           <w:p>
             <w:pPr>
               <w:keepNext w:val="0"/>
@@ -1060,7 +1196,29 @@
               <w:widowControl/>
               <w:suppressLineNumbers w:val="0"/>
               <w:jc w:val="left"/>
-              <w:textAlignment w:val="center"/>
+              <w:rPr>
+                <w:rFonts w:hint="default" w:ascii="Times New Roman" w:hAnsi="Times New Roman" w:cs="Times New Roman"/>
+                <w:sz w:val="26"/>
+                <w:szCs w:val="26"/>
+              </w:rPr>
+            </w:pPr>
+          </w:p>
+          <w:p>
+            <w:pPr>
+              <w:pStyle w:val="34"/>
+              <w:keepNext w:val="0"/>
+              <w:keepLines w:val="0"/>
+              <w:widowControl/>
+              <w:suppressLineNumbers w:val="0"/>
+              <w:pBdr>
+                <w:top w:val="none" w:color="1F1F1F" w:sz="0" w:space="0"/>
+                <w:left w:val="none" w:color="1F1F1F" w:sz="0" w:space="0"/>
+                <w:bottom w:val="none" w:color="1F1F1F" w:sz="0" w:space="0"/>
+                <w:right w:val="none" w:color="1F1F1F" w:sz="0" w:space="0"/>
+              </w:pBdr>
+              <w:bidi w:val="0"/>
+              <w:spacing w:before="0" w:beforeAutospacing="0" w:after="0" w:afterAutospacing="0" w:line="14" w:lineRule="atLeast"/>
+              <w:ind w:left="0" w:leftChars="0" w:right="0" w:rightChars="0"/>
               <w:rPr>
                 <w:rFonts w:hint="default" w:ascii="Times New Roman" w:hAnsi="Times New Roman" w:cs="Times New Roman"/>
                 <w:i w:val="0"/>
@@ -1073,18 +1231,32 @@
             </w:pPr>
             <w:r>
               <w:rPr>
-                <w:rFonts w:hint="default" w:ascii="Times New Roman" w:hAnsi="Times New Roman" w:eastAsia="SimSun" w:cs="Times New Roman"/>
-                <w:i w:val="0"/>
-                <w:iCs w:val="0"/>
-                <w:color w:val="000000"/>
-                <w:kern w:val="0"/>
+                <w:rFonts w:hint="default" w:ascii="Times New Roman" w:hAnsi="Times New Roman" w:eastAsia="sans-serif" w:cs="Times New Roman"/>
+                <w:color w:val="1F1F1F"/>
                 <w:sz w:val="26"/>
                 <w:szCs w:val="26"/>
-                <w:u w:val="none"/>
-                <w:bdr w:val="none" w:color="auto" w:sz="0" w:space="0"/>
-                <w:lang w:val="en-US" w:eastAsia="zh-CN" w:bidi="ar"/>
               </w:rPr>
-              <w:t>Cơ sở dữ liệu quan hệ, đảm bảo tính toàn vẹn dữ liệu.</w:t>
+              <w:t xml:space="preserve">- </w:t>
+            </w:r>
+            <w:r>
+              <w:rPr>
+                <w:rFonts w:hint="default" w:ascii="Times New Roman" w:hAnsi="Times New Roman" w:eastAsia="sans-serif" w:cs="Times New Roman"/>
+                <w:b/>
+                <w:bCs/>
+                <w:color w:val="1F1F1F"/>
+                <w:sz w:val="26"/>
+                <w:szCs w:val="26"/>
+              </w:rPr>
+              <w:t>Storage:</w:t>
+            </w:r>
+            <w:r>
+              <w:rPr>
+                <w:rFonts w:hint="default" w:ascii="Times New Roman" w:hAnsi="Times New Roman" w:eastAsia="sans-serif" w:cs="Times New Roman"/>
+                <w:color w:val="1F1F1F"/>
+                <w:sz w:val="26"/>
+                <w:szCs w:val="26"/>
+              </w:rPr>
+              <w:t xml:space="preserve"> Lưu trữ ảnh đại diện, tài liệu.</w:t>
             </w:r>
           </w:p>
         </w:tc>
@@ -1099,7 +1271,6 @@
             <w:insideH w:val="none" w:color="auto" w:sz="0" w:space="0"/>
             <w:insideV w:val="none" w:color="auto" w:sz="0" w:space="0"/>
           </w:tblBorders>
-          <w:shd w:val="clear"/>
           <w:tblCellMar>
             <w:top w:w="0" w:type="dxa"/>
             <w:left w:w="108" w:type="dxa"/>
@@ -1119,7 +1290,7 @@
               <w:bottom w:val="single" w:color="000000" w:sz="8" w:space="0"/>
               <w:right w:val="single" w:color="000000" w:sz="8" w:space="0"/>
             </w:tcBorders>
-            <w:shd w:val="clear"/>
+            <w:shd w:val="clear" w:color="auto" w:fill="auto"/>
             <w:vAlign w:val="center"/>
           </w:tcPr>
           <w:p>
@@ -1128,8 +1299,10 @@
               <w:keepLines w:val="0"/>
               <w:widowControl/>
               <w:suppressLineNumbers w:val="0"/>
+              <w:bidi w:val="0"/>
+              <w:spacing w:before="0" w:beforeAutospacing="0" w:after="0" w:afterAutospacing="0" w:line="14" w:lineRule="atLeast"/>
+              <w:ind w:left="0" w:leftChars="0" w:right="0" w:rightChars="0"/>
               <w:jc w:val="left"/>
-              <w:textAlignment w:val="center"/>
               <w:rPr>
                 <w:rFonts w:hint="default" w:ascii="Times New Roman" w:hAnsi="Times New Roman" w:cs="Times New Roman"/>
                 <w:b/>
@@ -1144,20 +1317,16 @@
             </w:pPr>
             <w:r>
               <w:rPr>
-                <w:rFonts w:hint="default" w:ascii="Times New Roman" w:hAnsi="Times New Roman" w:eastAsia="SimSun" w:cs="Times New Roman"/>
+                <w:rFonts w:hint="default" w:ascii="Times New Roman" w:hAnsi="Times New Roman" w:eastAsia="sans-serif" w:cs="Times New Roman"/>
                 <w:b/>
                 <w:bCs/>
-                <w:i w:val="0"/>
-                <w:iCs w:val="0"/>
-                <w:color w:val="000000"/>
+                <w:color w:val="1F1F1F"/>
                 <w:kern w:val="0"/>
                 <w:sz w:val="26"/>
                 <w:szCs w:val="26"/>
-                <w:u w:val="none"/>
-                <w:bdr w:val="none" w:color="auto" w:sz="0" w:space="0"/>
                 <w:lang w:val="en-US" w:eastAsia="zh-CN" w:bidi="ar"/>
               </w:rPr>
-              <w:t>Hỗ trợ</w:t>
+              <w:t>Notification</w:t>
             </w:r>
           </w:p>
         </w:tc>
@@ -1170,7 +1339,7 @@
               <w:bottom w:val="single" w:color="000000" w:sz="8" w:space="0"/>
               <w:right w:val="single" w:color="000000" w:sz="8" w:space="0"/>
             </w:tcBorders>
-            <w:shd w:val="clear"/>
+            <w:shd w:val="clear" w:color="auto" w:fill="auto"/>
             <w:vAlign w:val="center"/>
           </w:tcPr>
           <w:p>
@@ -1179,8 +1348,10 @@
               <w:keepLines w:val="0"/>
               <w:widowControl/>
               <w:suppressLineNumbers w:val="0"/>
+              <w:bidi w:val="0"/>
+              <w:spacing w:before="0" w:beforeAutospacing="0" w:after="0" w:afterAutospacing="0" w:line="14" w:lineRule="atLeast"/>
+              <w:ind w:left="0" w:leftChars="0" w:right="0" w:rightChars="0"/>
               <w:jc w:val="left"/>
-              <w:textAlignment w:val="center"/>
               <w:rPr>
                 <w:rFonts w:hint="default" w:ascii="Times New Roman" w:hAnsi="Times New Roman" w:cs="Times New Roman"/>
                 <w:b/>
@@ -1191,24 +1362,19 @@
                 <w:sz w:val="26"/>
                 <w:szCs w:val="26"/>
                 <w:u w:val="none"/>
+                <w:lang w:val="en-US"/>
               </w:rPr>
             </w:pPr>
             <w:r>
               <w:rPr>
-                <w:rFonts w:hint="default" w:ascii="Times New Roman" w:hAnsi="Times New Roman" w:eastAsia="SimSun" w:cs="Times New Roman"/>
-                <w:b/>
-                <w:bCs/>
-                <w:i w:val="0"/>
-                <w:iCs w:val="0"/>
-                <w:color w:val="000000"/>
+                <w:rFonts w:hint="default" w:ascii="Times New Roman" w:hAnsi="Times New Roman" w:eastAsia="sans-serif" w:cs="Times New Roman"/>
+                <w:color w:val="1F1F1F"/>
                 <w:kern w:val="0"/>
                 <w:sz w:val="26"/>
                 <w:szCs w:val="26"/>
-                <w:u w:val="none"/>
-                <w:bdr w:val="none" w:color="auto" w:sz="0" w:space="0"/>
                 <w:lang w:val="en-US" w:eastAsia="zh-CN" w:bidi="ar"/>
               </w:rPr>
-              <w:t>Firebase</w:t>
+              <w:t>Firebase FCM</w:t>
             </w:r>
           </w:p>
         </w:tc>
@@ -1221,7 +1387,7 @@
               <w:bottom w:val="single" w:color="000000" w:sz="8" w:space="0"/>
               <w:right w:val="single" w:color="000000" w:sz="8" w:space="0"/>
             </w:tcBorders>
-            <w:shd w:val="clear"/>
+            <w:shd w:val="clear" w:color="auto" w:fill="auto"/>
             <w:vAlign w:val="center"/>
           </w:tcPr>
           <w:p>
@@ -1230,8 +1396,10 @@
               <w:keepLines w:val="0"/>
               <w:widowControl/>
               <w:suppressLineNumbers w:val="0"/>
+              <w:bidi w:val="0"/>
+              <w:spacing w:before="0" w:beforeAutospacing="0" w:after="0" w:afterAutospacing="0" w:line="14" w:lineRule="atLeast"/>
+              <w:ind w:left="0" w:leftChars="0" w:right="0" w:rightChars="0"/>
               <w:jc w:val="left"/>
-              <w:textAlignment w:val="center"/>
               <w:rPr>
                 <w:rFonts w:hint="default" w:ascii="Times New Roman" w:hAnsi="Times New Roman" w:cs="Times New Roman"/>
                 <w:i w:val="0"/>
@@ -1244,18 +1412,14 @@
             </w:pPr>
             <w:r>
               <w:rPr>
-                <w:rFonts w:hint="default" w:ascii="Times New Roman" w:hAnsi="Times New Roman" w:eastAsia="SimSun" w:cs="Times New Roman"/>
-                <w:i w:val="0"/>
-                <w:iCs w:val="0"/>
-                <w:color w:val="000000"/>
+                <w:rFonts w:hint="default" w:ascii="Times New Roman" w:hAnsi="Times New Roman" w:eastAsia="sans-serif" w:cs="Times New Roman"/>
+                <w:color w:val="1F1F1F"/>
                 <w:kern w:val="0"/>
                 <w:sz w:val="26"/>
                 <w:szCs w:val="26"/>
-                <w:u w:val="none"/>
-                <w:bdr w:val="none" w:color="auto" w:sz="0" w:space="0"/>
                 <w:lang w:val="en-US" w:eastAsia="zh-CN" w:bidi="ar"/>
               </w:rPr>
-              <w:t>Authentication (xác thực Google) &amp; Push Notification (thông báo lịch/điểm).</w:t>
+              <w:t>Kết hợp với Supabase để đẩy thông báo (Push Notification) đến thiết bị di động.</w:t>
             </w:r>
           </w:p>
         </w:tc>
@@ -1278,39 +1442,31 @@
           <w:szCs w:val="26"/>
         </w:rPr>
       </w:pPr>
+    </w:p>
+    <w:p>
+      <w:pPr>
+        <w:pStyle w:val="2"/>
+        <w:rPr>
+          <w:rFonts w:hint="default" w:ascii="Times New Roman" w:hAnsi="Times New Roman" w:cs="Times New Roman"/>
+          <w:color w:val="auto"/>
+          <w:sz w:val="26"/>
+          <w:szCs w:val="26"/>
+        </w:rPr>
+      </w:pPr>
       <w:r>
         <w:rPr>
           <w:rFonts w:hint="default" w:ascii="Times New Roman" w:hAnsi="Times New Roman" w:cs="Times New Roman"/>
-          <w:sz w:val="26"/>
-          <w:szCs w:val="26"/>
-        </w:rPr>
-        <w:br w:type="page"/>
+          <w:color w:val="auto"/>
+          <w:sz w:val="26"/>
+          <w:szCs w:val="26"/>
+        </w:rPr>
+        <w:t>3. Phân hệ Chức năng &amp; Nghiệp vụ</w:t>
       </w:r>
       <w:bookmarkStart w:id="0" w:name="_GoBack"/>
       <w:bookmarkEnd w:id="0"/>
     </w:p>
     <w:p>
       <w:pPr>
-        <w:pStyle w:val="2"/>
-        <w:rPr>
-          <w:rFonts w:hint="default" w:ascii="Times New Roman" w:hAnsi="Times New Roman" w:cs="Times New Roman"/>
-          <w:color w:val="auto"/>
-          <w:sz w:val="32"/>
-          <w:szCs w:val="32"/>
-        </w:rPr>
-      </w:pPr>
-      <w:r>
-        <w:rPr>
-          <w:rFonts w:hint="default" w:ascii="Times New Roman" w:hAnsi="Times New Roman" w:cs="Times New Roman"/>
-          <w:color w:val="auto"/>
-          <w:sz w:val="32"/>
-          <w:szCs w:val="32"/>
-        </w:rPr>
-        <w:t>3. Phân hệ Chức năng &amp; Nghiệp vụ</w:t>
-      </w:r>
-    </w:p>
-    <w:p>
-      <w:pPr>
         <w:rPr>
           <w:rFonts w:hint="default" w:ascii="Times New Roman" w:hAnsi="Times New Roman" w:cs="Times New Roman"/>
           <w:sz w:val="26"/>
@@ -1350,6 +1506,45 @@
     <w:p>
       <w:pPr>
         <w:rPr>
+          <w:rFonts w:hint="default" w:ascii="Times New Roman" w:hAnsi="Times New Roman" w:eastAsia="SimSun" w:cs="Times New Roman"/>
+          <w:b/>
+          <w:bCs/>
+          <w:sz w:val="24"/>
+          <w:szCs w:val="24"/>
+        </w:rPr>
+      </w:pPr>
+      <w:r>
+        <w:rPr>
+          <w:rFonts w:hint="default" w:ascii="Times New Roman" w:hAnsi="Times New Roman" w:eastAsia="SimSun" w:cs="Times New Roman"/>
+          <w:b/>
+          <w:bCs/>
+          <w:sz w:val="24"/>
+          <w:szCs w:val="24"/>
+        </w:rPr>
+        <w:t>Website</w:t>
+      </w:r>
+      <w:r>
+        <w:rPr>
+          <w:rFonts w:hint="default" w:ascii="Times New Roman" w:hAnsi="Times New Roman" w:eastAsia="SimSun" w:cs="Times New Roman"/>
+          <w:sz w:val="24"/>
+          <w:szCs w:val="24"/>
+        </w:rPr>
+        <w:t xml:space="preserve"> và </w:t>
+      </w:r>
+      <w:r>
+        <w:rPr>
+          <w:rFonts w:hint="default" w:ascii="Times New Roman" w:hAnsi="Times New Roman" w:eastAsia="SimSun" w:cs="Times New Roman"/>
+          <w:b/>
+          <w:bCs/>
+          <w:sz w:val="24"/>
+          <w:szCs w:val="24"/>
+        </w:rPr>
+        <w:t>Mobile App</w:t>
+      </w:r>
+    </w:p>
+    <w:p>
+      <w:pPr>
+        <w:rPr>
           <w:rFonts w:hint="default" w:ascii="Times New Roman" w:hAnsi="Times New Roman" w:cs="Times New Roman"/>
           <w:sz w:val="26"/>
           <w:szCs w:val="26"/>
@@ -1653,6 +1848,43 @@
       </w:pPr>
       <w:r>
         <w:rPr>
+          <w:rFonts w:hint="default" w:ascii="Times New Roman" w:hAnsi="Times New Roman" w:eastAsia="SimSun" w:cs="Times New Roman"/>
+          <w:b/>
+          <w:bCs/>
+          <w:sz w:val="24"/>
+          <w:szCs w:val="24"/>
+        </w:rPr>
+        <w:t>Website</w:t>
+      </w:r>
+      <w:r>
+        <w:rPr>
+          <w:rFonts w:hint="default" w:ascii="Times New Roman" w:hAnsi="Times New Roman" w:eastAsia="SimSun" w:cs="Times New Roman"/>
+          <w:sz w:val="24"/>
+          <w:szCs w:val="24"/>
+        </w:rPr>
+        <w:t xml:space="preserve"> và </w:t>
+      </w:r>
+      <w:r>
+        <w:rPr>
+          <w:rFonts w:hint="default" w:ascii="Times New Roman" w:hAnsi="Times New Roman" w:eastAsia="SimSun" w:cs="Times New Roman"/>
+          <w:b/>
+          <w:bCs/>
+          <w:sz w:val="24"/>
+          <w:szCs w:val="24"/>
+        </w:rPr>
+        <w:t>Mobile App</w:t>
+      </w:r>
+    </w:p>
+    <w:p>
+      <w:pPr>
+        <w:rPr>
+          <w:rFonts w:hint="default" w:ascii="Times New Roman" w:hAnsi="Times New Roman" w:cs="Times New Roman"/>
+          <w:sz w:val="26"/>
+          <w:szCs w:val="26"/>
+        </w:rPr>
+      </w:pPr>
+      <w:r>
+        <w:rPr>
           <w:rFonts w:hint="default" w:ascii="Times New Roman" w:hAnsi="Times New Roman" w:cs="Times New Roman"/>
           <w:sz w:val="26"/>
           <w:szCs w:val="26"/>
@@ -1849,18 +2081,40 @@
     <w:p>
       <w:pPr>
         <w:rPr>
-          <w:rFonts w:hint="default" w:ascii="Times New Roman" w:hAnsi="Times New Roman" w:cs="Times New Roman"/>
-          <w:sz w:val="26"/>
-          <w:szCs w:val="26"/>
+          <w:rFonts w:hint="default" w:ascii="Times New Roman" w:hAnsi="Times New Roman" w:eastAsia="SimSun" w:cs="Times New Roman"/>
+          <w:b/>
+          <w:bCs/>
+          <w:sz w:val="24"/>
+          <w:szCs w:val="24"/>
         </w:rPr>
       </w:pPr>
       <w:r>
         <w:rPr>
-          <w:rFonts w:hint="default" w:ascii="Times New Roman" w:hAnsi="Times New Roman" w:cs="Times New Roman"/>
-          <w:sz w:val="26"/>
-          <w:szCs w:val="26"/>
-        </w:rPr>
-        <w:t>Sử dụng nhiều trên Mobile App.</w:t>
+          <w:rFonts w:hint="default" w:ascii="Times New Roman" w:hAnsi="Times New Roman" w:eastAsia="SimSun" w:cs="Times New Roman"/>
+          <w:b/>
+          <w:bCs/>
+          <w:sz w:val="24"/>
+          <w:szCs w:val="24"/>
+        </w:rPr>
+        <w:t>Website</w:t>
+      </w:r>
+      <w:r>
+        <w:rPr>
+          <w:rFonts w:hint="default" w:ascii="Times New Roman" w:hAnsi="Times New Roman" w:eastAsia="SimSun" w:cs="Times New Roman"/>
+          <w:sz w:val="24"/>
+          <w:szCs w:val="24"/>
+        </w:rPr>
+        <w:t xml:space="preserve"> và </w:t>
+      </w:r>
+      <w:r>
+        <w:rPr>
+          <w:rFonts w:hint="default" w:ascii="Times New Roman" w:hAnsi="Times New Roman" w:eastAsia="SimSun" w:cs="Times New Roman"/>
+          <w:b/>
+          <w:bCs/>
+          <w:sz w:val="24"/>
+          <w:szCs w:val="24"/>
+        </w:rPr>
+        <w:t>Mobile App</w:t>
       </w:r>
     </w:p>
     <w:p>
@@ -2007,16 +2261,18 @@
         <w:widowControl/>
         <w:suppressLineNumbers w:val="0"/>
         <w:rPr>
+          <w:rFonts w:hint="default" w:ascii="Times New Roman" w:hAnsi="Times New Roman" w:cs="Times New Roman"/>
           <w:color w:val="auto"/>
-          <w:sz w:val="32"/>
-          <w:szCs w:val="32"/>
+          <w:sz w:val="26"/>
+          <w:szCs w:val="26"/>
         </w:rPr>
       </w:pPr>
       <w:r>
         <w:rPr>
+          <w:rFonts w:hint="default" w:ascii="Times New Roman" w:hAnsi="Times New Roman" w:cs="Times New Roman"/>
           <w:color w:val="auto"/>
-          <w:sz w:val="32"/>
-          <w:szCs w:val="32"/>
+          <w:sz w:val="26"/>
+          <w:szCs w:val="26"/>
         </w:rPr>
         <w:t>4. Thiết kế Cơ sở dữ liệu (Database Schema)</w:t>
       </w:r>
@@ -2075,63 +2331,27 @@
         <w:keepLines w:val="0"/>
         <w:widowControl/>
         <w:suppressLineNumbers w:val="0"/>
-        <w:ind w:left="1440"/>
-        <w:rPr>
-          <w:rFonts w:hint="default" w:ascii="Times New Roman" w:hAnsi="Times New Roman" w:cs="Times New Roman"/>
-          <w:sz w:val="26"/>
-          <w:szCs w:val="26"/>
-        </w:rPr>
+        <w:ind w:firstLine="720" w:firstLineChars="0"/>
       </w:pPr>
       <w:r>
         <w:rPr>
-          <w:rStyle w:val="20"/>
-          <w:rFonts w:hint="default" w:ascii="Times New Roman" w:hAnsi="Times New Roman" w:cs="Times New Roman"/>
-          <w:sz w:val="26"/>
-          <w:szCs w:val="26"/>
-        </w:rPr>
-        <w:t>users</w:t>
+          <w:b/>
+          <w:bCs/>
+        </w:rPr>
+        <w:t>users:</w:t>
       </w:r>
       <w:r>
-        <w:rPr>
-          <w:rFonts w:hint="default" w:ascii="Times New Roman" w:hAnsi="Times New Roman" w:cs="Times New Roman"/>
-          <w:sz w:val="26"/>
-          <w:szCs w:val="26"/>
-        </w:rPr>
-        <w:t xml:space="preserve">: Bảng trung tâm, </w:t>
+        <w:t xml:space="preserve"> Bảng trung tâm, liên kết chặt chẽ với </w:t>
       </w:r>
       <w:r>
         <w:rPr>
-          <w:rStyle w:val="20"/>
-          <w:rFonts w:hint="default" w:ascii="Times New Roman" w:hAnsi="Times New Roman" w:cs="Times New Roman"/>
-          <w:sz w:val="26"/>
-          <w:szCs w:val="26"/>
-        </w:rPr>
-        <w:t>email</w:t>
+          <w:b/>
+          <w:bCs/>
+        </w:rPr>
+        <w:t>Supabase Auth</w:t>
       </w:r>
       <w:r>
-        <w:rPr>
-          <w:rFonts w:hint="default" w:ascii="Times New Roman" w:hAnsi="Times New Roman" w:cs="Times New Roman"/>
-          <w:sz w:val="26"/>
-          <w:szCs w:val="26"/>
-        </w:rPr>
-        <w:t xml:space="preserve"> là khóa duy nhất (hỗ trợ Google Login), </w:t>
-      </w:r>
-      <w:r>
-        <w:rPr>
-          <w:rStyle w:val="20"/>
-          <w:rFonts w:hint="default" w:ascii="Times New Roman" w:hAnsi="Times New Roman" w:cs="Times New Roman"/>
-          <w:sz w:val="26"/>
-          <w:szCs w:val="26"/>
-        </w:rPr>
-        <w:t>role</w:t>
-      </w:r>
-      <w:r>
-        <w:rPr>
-          <w:rFonts w:hint="default" w:ascii="Times New Roman" w:hAnsi="Times New Roman" w:cs="Times New Roman"/>
-          <w:sz w:val="26"/>
-          <w:szCs w:val="26"/>
-        </w:rPr>
-        <w:t xml:space="preserve"> phân quyền</w:t>
+        <w:t>.</w:t>
       </w:r>
     </w:p>
     <w:p>
@@ -2141,62 +2361,82 @@
         <w:keepLines w:val="0"/>
         <w:widowControl/>
         <w:suppressLineNumbers w:val="0"/>
-        <w:ind w:left="1440"/>
-        <w:rPr>
-          <w:rFonts w:hint="default" w:ascii="Times New Roman" w:hAnsi="Times New Roman" w:cs="Times New Roman"/>
-          <w:sz w:val="26"/>
-          <w:szCs w:val="26"/>
-        </w:rPr>
+        <w:ind w:left="720" w:leftChars="0" w:firstLine="720" w:firstLineChars="0"/>
       </w:pPr>
       <w:r>
-        <w:rPr>
-          <w:rStyle w:val="20"/>
-          <w:rFonts w:hint="default" w:ascii="Times New Roman" w:hAnsi="Times New Roman" w:cs="Times New Roman"/>
-          <w:sz w:val="26"/>
-          <w:szCs w:val="26"/>
-        </w:rPr>
-        <w:t>lecturers</w:t>
+        <w:t xml:space="preserve">Sử dụng </w:t>
       </w:r>
       <w:r>
         <w:rPr>
-          <w:rFonts w:hint="default" w:ascii="Times New Roman" w:hAnsi="Times New Roman" w:cs="Times New Roman"/>
-          <w:sz w:val="26"/>
-          <w:szCs w:val="26"/>
-        </w:rPr>
-        <w:t xml:space="preserve">, </w:t>
+          <w:rStyle w:val="20"/>
+        </w:rPr>
+        <w:t>user_id</w:t>
       </w:r>
       <w:r>
-        <w:rPr>
-          <w:rStyle w:val="20"/>
-          <w:rFonts w:hint="default" w:ascii="Times New Roman" w:hAnsi="Times New Roman" w:cs="Times New Roman"/>
-          <w:sz w:val="26"/>
-          <w:szCs w:val="26"/>
-        </w:rPr>
-        <w:t>students</w:t>
+        <w:t xml:space="preserve"> (hoặc UID từ Supabase) làm khóa chính.</w:t>
+      </w:r>
+    </w:p>
+    <w:p>
+      <w:pPr>
+        <w:pStyle w:val="34"/>
+        <w:keepNext w:val="0"/>
+        <w:keepLines w:val="0"/>
+        <w:widowControl/>
+        <w:suppressLineNumbers w:val="0"/>
+        <w:ind w:left="720" w:leftChars="0" w:firstLine="720" w:firstLineChars="0"/>
+      </w:pPr>
+      <w:r>
+        <w:t>Email được đồng bộ từ Supabase Auth để định danh.</w:t>
+      </w:r>
+    </w:p>
+    <w:p>
+      <w:pPr>
+        <w:pStyle w:val="34"/>
+        <w:keepNext w:val="0"/>
+        <w:keepLines w:val="0"/>
+        <w:widowControl/>
+        <w:suppressLineNumbers w:val="0"/>
+        <w:ind w:left="720" w:leftChars="0" w:firstLine="720" w:firstLineChars="0"/>
+      </w:pPr>
+      <w:r>
+        <w:t>Phân quyền (Role-based) để xác định giao diện hiển thị cho Admin, Lecturer, hay Student.</w:t>
+      </w:r>
+    </w:p>
+    <w:p>
+      <w:pPr>
+        <w:pStyle w:val="34"/>
+        <w:keepNext w:val="0"/>
+        <w:keepLines w:val="0"/>
+        <w:widowControl/>
+        <w:suppressLineNumbers w:val="0"/>
+        <w:ind w:firstLine="720" w:firstLineChars="0"/>
+      </w:pPr>
+      <w:r>
+        <w:rPr>
+          <w:b/>
+          <w:bCs/>
+        </w:rPr>
+        <w:t>lecturers, students:</w:t>
       </w:r>
       <w:r>
-        <w:rPr>
-          <w:rFonts w:hint="default" w:ascii="Times New Roman" w:hAnsi="Times New Roman" w:cs="Times New Roman"/>
-          <w:sz w:val="26"/>
-          <w:szCs w:val="26"/>
-        </w:rPr>
-        <w:t xml:space="preserve">: Bảng mở rộng thông tin chi tiết, liên kết 1-1 với </w:t>
+        <w:t xml:space="preserve"> Bảng mở rộng thông tin chi tiết (Hồ sơ), liên kết 1-1 với bảng </w:t>
       </w:r>
       <w:r>
         <w:rPr>
           <w:rStyle w:val="20"/>
-          <w:rFonts w:hint="default" w:ascii="Times New Roman" w:hAnsi="Times New Roman" w:cs="Times New Roman"/>
-          <w:sz w:val="26"/>
-          <w:szCs w:val="26"/>
         </w:rPr>
         <w:t>users</w:t>
       </w:r>
       <w:r>
-        <w:rPr>
-          <w:rFonts w:hint="default" w:ascii="Times New Roman" w:hAnsi="Times New Roman" w:cs="Times New Roman"/>
-          <w:sz w:val="26"/>
-          <w:szCs w:val="26"/>
-        </w:rPr>
+        <w:t xml:space="preserve"> thông qua </w:t>
+      </w:r>
+      <w:r>
+        <w:rPr>
+          <w:rStyle w:val="20"/>
+        </w:rPr>
+        <w:t>user_id</w:t>
+      </w:r>
+      <w:r>
         <w:t>.</w:t>
       </w:r>
     </w:p>
@@ -2216,6 +2456,20 @@
       </w:pPr>
       <w:r>
         <w:rPr>
+          <w:rFonts w:hint="default" w:ascii="Symbol" w:hAnsi="Symbol" w:eastAsia="Symbol" w:cs="Symbol"/>
+          <w:sz w:val="24"/>
+        </w:rPr>
+        <w:t>·</w:t>
+      </w:r>
+      <w:r>
+        <w:rPr>
+          <w:rFonts w:hint="eastAsia" w:ascii="SimSun" w:hAnsi="SimSun" w:eastAsia="SimSun" w:cs="SimSun"/>
+          <w:sz w:val="24"/>
+        </w:rPr>
+        <w:t xml:space="preserve">  </w:t>
+      </w:r>
+      <w:r>
+        <w:rPr>
           <w:rFonts w:hint="default" w:ascii="Times New Roman" w:hAnsi="Times New Roman" w:cs="Times New Roman"/>
           <w:b/>
           <w:bCs/>
@@ -2600,7 +2854,19 @@
       </w:r>
     </w:p>
     <w:p>
+      <w:pPr>
+        <w:rPr>
+          <w:rFonts w:hint="default" w:ascii="Times New Roman" w:hAnsi="Times New Roman" w:cs="Times New Roman"/>
+          <w:sz w:val="26"/>
+          <w:szCs w:val="26"/>
+        </w:rPr>
+      </w:pPr>
       <w:r>
+        <w:rPr>
+          <w:rFonts w:hint="default" w:ascii="Times New Roman" w:hAnsi="Times New Roman" w:cs="Times New Roman"/>
+          <w:sz w:val="26"/>
+          <w:szCs w:val="26"/>
+        </w:rPr>
         <w:br w:type="page"/>
       </w:r>
     </w:p>
@@ -2610,8 +2876,18 @@
         <w:keepLines w:val="0"/>
         <w:widowControl/>
         <w:suppressLineNumbers w:val="0"/>
+        <w:rPr>
+          <w:rFonts w:hint="default" w:ascii="Times New Roman" w:hAnsi="Times New Roman" w:cs="Times New Roman"/>
+          <w:sz w:val="26"/>
+          <w:szCs w:val="26"/>
+        </w:rPr>
       </w:pPr>
       <w:r>
+        <w:rPr>
+          <w:rFonts w:hint="default" w:ascii="Times New Roman" w:hAnsi="Times New Roman" w:cs="Times New Roman"/>
+          <w:sz w:val="26"/>
+          <w:szCs w:val="26"/>
+        </w:rPr>
         <w:pict>
           <v:rect id="_x0000_i1025" o:spt="1" style="height:1.5pt;width:432pt;" fillcolor="#A0A0A0" filled="t" stroked="f" coordsize="21600,21600" o:hr="t" o:hrstd="t" o:hralign="center">
             <v:path/>
@@ -2633,16 +2909,18 @@
         <w:widowControl/>
         <w:suppressLineNumbers w:val="0"/>
         <w:rPr>
+          <w:rFonts w:hint="default" w:ascii="Times New Roman" w:hAnsi="Times New Roman" w:cs="Times New Roman"/>
           <w:color w:val="auto"/>
-          <w:sz w:val="32"/>
-          <w:szCs w:val="32"/>
+          <w:sz w:val="26"/>
+          <w:szCs w:val="26"/>
         </w:rPr>
       </w:pPr>
       <w:r>
         <w:rPr>
+          <w:rFonts w:hint="default" w:ascii="Times New Roman" w:hAnsi="Times New Roman" w:cs="Times New Roman"/>
           <w:color w:val="auto"/>
-          <w:sz w:val="32"/>
-          <w:szCs w:val="32"/>
+          <w:sz w:val="26"/>
+          <w:szCs w:val="26"/>
         </w:rPr>
         <w:t>5. Các luồng dữ liệu quan trọng (Logic từ SQL)</w:t>
       </w:r>
@@ -2824,37 +3102,99 @@
         <w:keepLines w:val="0"/>
         <w:widowControl/>
         <w:suppressLineNumbers w:val="0"/>
-        <w:ind w:left="1440"/>
-        <w:rPr>
-          <w:rFonts w:hint="default" w:ascii="Times New Roman" w:hAnsi="Times New Roman" w:cs="Times New Roman"/>
-          <w:sz w:val="26"/>
-          <w:szCs w:val="26"/>
-        </w:rPr>
+        <w:ind w:left="720" w:leftChars="0" w:firstLine="720" w:firstLineChars="0"/>
       </w:pPr>
       <w:r>
-        <w:rPr>
-          <w:rFonts w:hint="default" w:ascii="Times New Roman" w:hAnsi="Times New Roman" w:cs="Times New Roman"/>
-          <w:sz w:val="26"/>
-          <w:szCs w:val="26"/>
-        </w:rPr>
-        <w:t xml:space="preserve">Sử dụng </w:t>
+        <w:t xml:space="preserve">Người dùng đăng nhập trên Client (Web/Mobile) thông qua </w:t>
       </w:r>
       <w:r>
         <w:rPr>
-          <w:rStyle w:val="20"/>
-          <w:rFonts w:hint="default" w:ascii="Times New Roman" w:hAnsi="Times New Roman" w:cs="Times New Roman"/>
-          <w:sz w:val="26"/>
-          <w:szCs w:val="26"/>
-        </w:rPr>
-        <w:t>users.email</w:t>
+          <w:b/>
+          <w:bCs/>
+        </w:rPr>
+        <w:t>Supabase Auth</w:t>
       </w:r>
       <w:r>
-        <w:rPr>
-          <w:rFonts w:hint="default" w:ascii="Times New Roman" w:hAnsi="Times New Roman" w:cs="Times New Roman"/>
-          <w:sz w:val="26"/>
-          <w:szCs w:val="26"/>
-        </w:rPr>
-        <w:t xml:space="preserve"> để đối chiếu với Google Auth. Không lưu mật khẩu trong database, tăng tính bảo mật.</w:t>
+        <w:t xml:space="preserve"> (Email/Password hoặc Google Login).</w:t>
+      </w:r>
+    </w:p>
+    <w:p>
+      <w:pPr>
+        <w:pStyle w:val="34"/>
+        <w:keepNext w:val="0"/>
+        <w:keepLines w:val="0"/>
+        <w:widowControl/>
+        <w:suppressLineNumbers w:val="0"/>
+        <w:ind w:left="720" w:leftChars="0" w:firstLine="720" w:firstLineChars="0"/>
+      </w:pPr>
+      <w:r>
+        <w:t xml:space="preserve">Supabase trả về </w:t>
+      </w:r>
+      <w:r>
+        <w:rPr>
+          <w:rStyle w:val="20"/>
+        </w:rPr>
+        <w:t>Access Token</w:t>
+      </w:r>
+      <w:r>
+        <w:t xml:space="preserve"> (JWT) và thông tin </w:t>
+      </w:r>
+      <w:r>
+        <w:rPr>
+          <w:rStyle w:val="20"/>
+        </w:rPr>
+        <w:t>User Session</w:t>
+      </w:r>
+      <w:r>
+        <w:t>.</w:t>
+      </w:r>
+    </w:p>
+    <w:p>
+      <w:pPr>
+        <w:pStyle w:val="34"/>
+        <w:keepNext w:val="0"/>
+        <w:keepLines w:val="0"/>
+        <w:widowControl/>
+        <w:suppressLineNumbers w:val="0"/>
+        <w:ind w:left="720" w:leftChars="0" w:firstLine="720" w:firstLineChars="0"/>
+      </w:pPr>
+      <w:r>
+        <w:t xml:space="preserve">Hệ thống tự động kiểm tra bảng </w:t>
+      </w:r>
+      <w:r>
+        <w:rPr>
+          <w:rStyle w:val="20"/>
+        </w:rPr>
+        <w:t>public.users</w:t>
+      </w:r>
+      <w:r>
+        <w:t xml:space="preserve"> để xác định vai trò (Role: ADMIN, LECTURER, STUDENT).</w:t>
+      </w:r>
+    </w:p>
+    <w:p>
+      <w:pPr>
+        <w:pStyle w:val="34"/>
+        <w:keepNext w:val="0"/>
+        <w:keepLines w:val="0"/>
+        <w:widowControl/>
+        <w:suppressLineNumbers w:val="0"/>
+        <w:ind w:left="720" w:leftChars="0" w:firstLine="720" w:firstLineChars="0"/>
+      </w:pPr>
+      <w:r>
+        <w:t>Client điều hướng vào màn hình chức năng tương ứng dựa trên Role đã xác thực.</w:t>
+      </w:r>
+    </w:p>
+    <w:p>
+      <w:pPr>
+        <w:pStyle w:val="34"/>
+        <w:keepNext w:val="0"/>
+        <w:keepLines w:val="0"/>
+        <w:widowControl/>
+        <w:suppressLineNumbers w:val="0"/>
+        <w:ind w:left="720" w:leftChars="0" w:firstLine="720" w:firstLineChars="0"/>
+      </w:pPr>
+      <w:r>
+        <w:t>Mọi request gọi lên Database đều kèm theo Token để đảm bảo bảo mật (Row Level Security - RLS).</w:t>
       </w:r>
     </w:p>
     <w:p>
@@ -2871,6 +3211,20 @@
           <w:szCs w:val="26"/>
         </w:rPr>
       </w:pPr>
+      <w:r>
+        <w:rPr>
+          <w:rFonts w:hint="default" w:ascii="Symbol" w:hAnsi="Symbol" w:eastAsia="Symbol" w:cs="Symbol"/>
+          <w:sz w:val="24"/>
+        </w:rPr>
+        <w:t>·</w:t>
+      </w:r>
+      <w:r>
+        <w:rPr>
+          <w:rFonts w:hint="eastAsia" w:ascii="SimSun" w:hAnsi="SimSun" w:eastAsia="SimSun" w:cs="SimSun"/>
+          <w:sz w:val="24"/>
+        </w:rPr>
+        <w:t xml:space="preserve">  </w:t>
+      </w:r>
       <w:r>
         <w:rPr>
           <w:rFonts w:hint="default" w:ascii="Times New Roman" w:hAnsi="Times New Roman" w:cs="Times New Roman"/>
@@ -3992,6 +4346,7 @@
       <w:jc w:val="left"/>
     </w:pPr>
     <w:rPr>
+      <w:rFonts w:ascii="Times New Roman" w:hAnsi="Times New Roman" w:eastAsia="SimSun" w:cs="Times New Roman"/>
       <w:kern w:val="0"/>
       <w:sz w:val="24"/>
       <w:szCs w:val="24"/>

</xml_diff>